<commit_message>
Fixed font shrink and line spacing issues in native PDF reconstructor
</commit_message>
<xml_diff>
--- a/backend/outputs/LOB 310122_reconstructed_hi.docx
+++ b/backend/outputs/LOB 310122_reconstructed_hi.docx
@@ -16,9 +16,11 @@
         <w:rPr>
           <w:rFonts w:cs="Nirmala UI" w:eastAsia="Nirmala UI"/>
           <w:b/>
+          <w:bCs/>
+          <w:i w:val="0"/>
           <w:sz w:val="36"/>
-          <w:bCs w:val="1"/>
           <w:szCs w:val="36"/>
+          <w:u w:val="none"/>
         </w:rPr>
         <w:t>रजिया साभा</w:t>
       </w:r>
@@ -36,9 +38,11 @@
       <w:r>
         <w:rPr>
           <w:b/>
+          <w:bCs/>
+          <w:i w:val="0"/>
           <w:sz w:val="32"/>
-          <w:bCs w:val="1"/>
           <w:szCs w:val="32"/>
+          <w:u w:val="none"/>
         </w:rPr>
         <w:t>——</w:t>
       </w:r>
@@ -57,9 +61,11 @@
         <w:rPr>
           <w:rFonts w:cs="Nirmala UI" w:eastAsia="Nirmala UI"/>
           <w:b/>
+          <w:bCs/>
+          <w:i w:val="0"/>
           <w:sz w:val="32"/>
-          <w:bCs w:val="1"/>
           <w:szCs w:val="32"/>
+          <w:u w:val="none"/>
         </w:rPr>
         <w:t>बिज़नेस की सूची</w:t>
       </w:r>
@@ -81,66 +87,93 @@
       <w:r>
         <w:rPr>
           <w:rFonts w:cs="Nirmala UI" w:eastAsia="Nirmala UI"/>
+          <w:b w:val="0"/>
+          <w:i w:val="0"/>
           <w:sz w:val="20"/>
           <w:szCs w:val="20"/>
+          <w:u w:val="none"/>
         </w:rPr>
         <w:t>मोन.</w:t>
       </w:r>
       <w:r>
         <w:rPr>
           <w:rFonts w:cs="Nirmala UI" w:eastAsia="Nirmala UI"/>
+          <w:b w:val="0"/>
+          <w:i w:val="0"/>
           <w:sz w:val="20"/>
           <w:szCs w:val="20"/>
+          <w:u w:val="none"/>
         </w:rPr>
         <w:t>दिन में</w:t>
       </w:r>
       <w:r>
         <w:rPr>
+          <w:b w:val="0"/>
+          <w:i w:val="0"/>
           <w:sz w:val="20"/>
           <w:szCs w:val="20"/>
+          <w:u w:val="none"/>
         </w:rPr>
         <w:t xml:space="preserve">, </w:t>
       </w:r>
       <w:r>
         <w:rPr>
           <w:rFonts w:cs="Nirmala UI" w:eastAsia="Nirmala UI"/>
+          <w:b w:val="0"/>
+          <w:i w:val="0"/>
           <w:sz w:val="20"/>
           <w:szCs w:val="20"/>
+          <w:u w:val="none"/>
         </w:rPr>
         <w:t>जनवरी</w:t>
       </w:r>
       <w:r>
         <w:rPr>
+          <w:b w:val="0"/>
+          <w:i w:val="0"/>
           <w:sz w:val="20"/>
           <w:szCs w:val="20"/>
+          <w:u w:val="none"/>
         </w:rPr>
         <w:t xml:space="preserve"> </w:t>
       </w:r>
       <w:r>
         <w:rPr>
+          <w:b w:val="0"/>
+          <w:i w:val="0"/>
           <w:sz w:val="20"/>
           <w:szCs w:val="20"/>
+          <w:u w:val="none"/>
         </w:rPr>
         <w:t>31</w:t>
       </w:r>
       <w:r>
         <w:rPr>
+          <w:b w:val="0"/>
+          <w:i w:val="0"/>
           <w:sz w:val="20"/>
           <w:szCs w:val="20"/>
+          <w:u w:val="none"/>
         </w:rPr>
         <w:t>, 20</w:t>
       </w:r>
       <w:r>
         <w:rPr>
+          <w:b w:val="0"/>
+          <w:i w:val="0"/>
           <w:sz w:val="20"/>
           <w:szCs w:val="20"/>
+          <w:u w:val="none"/>
         </w:rPr>
         <w:t>2</w:t>
       </w:r>
       <w:r>
         <w:rPr>
+          <w:b w:val="0"/>
+          <w:i w:val="0"/>
           <w:sz w:val="20"/>
           <w:szCs w:val="20"/>
+          <w:u w:val="none"/>
         </w:rPr>
         <w:t>2</w:t>
       </w:r>
@@ -154,7 +187,11 @@
         <w:jc w:val="center"/>
       </w:pPr>
       <w:r>
-        <w:rPr/>
+        <w:rPr>
+          <w:b w:val="0"/>
+          <w:i w:val="0"/>
+          <w:u w:val="none"/>
+        </w:rPr>
         <w:t>_______</w:t>
       </w:r>
     </w:p>
@@ -168,20 +205,35 @@
         <w:jc w:val="center"/>
       </w:pPr>
       <w:r>
-        <w:rPr/>
+        <w:rPr>
+          <w:b w:val="0"/>
+          <w:i w:val="0"/>
+          <w:u w:val="none"/>
+        </w:rPr>
         <w:t>2</w:t>
       </w:r>
       <w:r>
-        <w:rPr/>
+        <w:rPr>
+          <w:b w:val="0"/>
+          <w:i w:val="0"/>
+          <w:u w:val="none"/>
+        </w:rPr>
         <w:t>-</w:t>
       </w:r>
       <w:r>
-        <w:rPr/>
+        <w:rPr>
+          <w:b w:val="0"/>
+          <w:i w:val="0"/>
+          <w:u w:val="none"/>
+        </w:rPr>
         <w:t>3</w:t>
       </w:r>
       <w:r>
         <w:rPr>
           <w:rFonts w:cs="Nirmala UI" w:eastAsia="Nirmala UI"/>
+          <w:b w:val="0"/>
+          <w:i w:val="0"/>
+          <w:u w:val="none"/>
         </w:rPr>
         <w:t>0 पी.एम..</w:t>
       </w:r>
@@ -198,7 +250,11 @@
         </w:rPr>
       </w:pPr>
       <w:r>
-        <w:rPr/>
+        <w:rPr>
+          <w:b w:val="0"/>
+          <w:i w:val="0"/>
+          <w:u w:val="none"/>
+        </w:rPr>
         <w:t>————</w:t>
       </w:r>
     </w:p>
@@ -216,6 +272,9 @@
       <w:r>
         <w:rPr>
           <w:rFonts w:cs="Nirmala UI" w:eastAsia="Nirmala UI"/>
+          <w:b w:val="0"/>
+          <w:i w:val="0"/>
+          <w:u w:val="none"/>
         </w:rPr>
         <w:t>टेबल पर प्रेसिडंट का कोड</w:t>
       </w:r>
@@ -235,53 +294,93 @@
       <w:r>
         <w:rPr>
           <w:rFonts w:cs="Nirmala UI" w:eastAsia="Nirmala UI"/>
+          <w:b w:val="0"/>
+          <w:i w:val="0"/>
+          <w:u w:val="none"/>
         </w:rPr>
         <w:t>सारणी पर बैठने के लिए व्यवस्था-जेनरल.</w:t>
       </w:r>
       <w:r>
-        <w:rPr/>
+        <w:rPr>
+          <w:b w:val="0"/>
+          <w:i w:val="0"/>
+          <w:u w:val="none"/>
+        </w:rPr>
         <w:t>,</w:t>
       </w:r>
       <w:r>
         <w:rPr>
           <w:rFonts w:cs="Nirmala UI" w:eastAsia="Nirmala UI"/>
+          <w:b w:val="0"/>
+          <w:i w:val="0"/>
+          <w:u w:val="none"/>
         </w:rPr>
         <w:t xml:space="preserve"> संसद के दोनों सदनों में राष्ट्रपति के अभिभाषण की एक प्रति (अंग्रेजी और हिंदी में) </w:t>
       </w:r>
       <w:r>
-        <w:rPr/>
+        <w:rPr>
+          <w:b w:val="0"/>
+          <w:i w:val="0"/>
+          <w:u w:val="none"/>
+        </w:rPr>
         <w:t>31</w:t>
       </w:r>
       <w:r>
         <w:rPr>
           <w:rFonts w:cs="Nirmala UI" w:eastAsia="Nirmala UI"/>
+          <w:b w:val="0"/>
+          <w:i w:val="0"/>
+          <w:u w:val="none"/>
         </w:rPr>
         <w:t>सेंट</w:t>
       </w:r>
       <w:r>
-        <w:rPr/>
+        <w:rPr>
+          <w:b w:val="0"/>
+          <w:i w:val="0"/>
+          <w:u w:val="none"/>
+        </w:rPr>
         <w:t xml:space="preserve"> </w:t>
       </w:r>
       <w:r>
         <w:rPr>
           <w:rFonts w:cs="Nirmala UI" w:eastAsia="Nirmala UI"/>
+          <w:b w:val="0"/>
+          <w:i w:val="0"/>
+          <w:u w:val="none"/>
         </w:rPr>
         <w:t>जनवरी</w:t>
       </w:r>
       <w:r>
-        <w:rPr/>
+        <w:rPr>
+          <w:b w:val="0"/>
+          <w:i w:val="0"/>
+          <w:u w:val="none"/>
+        </w:rPr>
         <w:t>, 20</w:t>
       </w:r>
       <w:r>
-        <w:rPr/>
+        <w:rPr>
+          <w:b w:val="0"/>
+          <w:i w:val="0"/>
+          <w:u w:val="none"/>
+        </w:rPr>
         <w:t>2</w:t>
       </w:r>
       <w:r>
-        <w:rPr/>
+        <w:rPr>
+          <w:b w:val="0"/>
+          <w:i w:val="0"/>
+          <w:u w:val="none"/>
+        </w:rPr>
         <w:t>2</w:t>
       </w:r>
       <w:r>
-        <w:rPr/>
+        <w:rPr>
+          <w:b w:val="0"/>
+          <w:i w:val="0"/>
+          <w:u w:val="none"/>
+        </w:rPr>
         <w:t>.</w:t>
       </w:r>
     </w:p>
@@ -300,8 +399,10 @@
       </w:pPr>
       <w:r>
         <w:rPr>
+          <w:b w:val="0"/>
           <w:i/>
-          <w:iCs w:val="1"/>
+          <w:iCs/>
+          <w:u w:val="none"/>
         </w:rPr>
         <w:t>————</w:t>
       </w:r>
@@ -320,12 +421,18 @@
       <w:r>
         <w:rPr>
           <w:rFonts w:cs="Nirmala UI" w:eastAsia="Nirmala UI"/>
+          <w:b w:val="0"/>
+          <w:i w:val="0"/>
+          <w:u w:val="none"/>
         </w:rPr>
         <w:t>ऑबिटियरी रिफ्रेंसी.</w:t>
       </w:r>
       <w:r>
         <w:rPr>
           <w:rFonts w:cs="Nirmala UI" w:eastAsia="Nirmala UI"/>
+          <w:b w:val="0"/>
+          <w:i w:val="0"/>
+          <w:u w:val="none"/>
         </w:rPr>
         <w:t>एस</w:t>
       </w:r>
@@ -349,35 +456,54 @@
       <w:r>
         <w:rPr>
           <w:rFonts w:cs="Nirmala UI" w:eastAsia="Nirmala UI"/>
+          <w:b w:val="0"/>
+          <w:i w:val="0"/>
+          <w:u w:val="none"/>
         </w:rPr>
         <w:t xml:space="preserve">       OBITUARY रीफ.</w:t>
       </w:r>
       <w:r>
         <w:rPr>
           <w:rFonts w:cs="Nirmala UI" w:eastAsia="Nirmala UI"/>
+          <w:b w:val="0"/>
+          <w:i w:val="0"/>
+          <w:u w:val="none"/>
         </w:rPr>
         <w:t>सीमा</w:t>
       </w:r>
       <w:r>
         <w:rPr>
           <w:rFonts w:cs="Nirmala UI" w:eastAsia="Nirmala UI"/>
+          <w:b w:val="0"/>
+          <w:i w:val="0"/>
+          <w:u w:val="none"/>
         </w:rPr>
         <w:t>एस</w:t>
       </w:r>
       <w:r>
         <w:rPr>
           <w:rFonts w:cs="Nirmala UI" w:eastAsia="Nirmala UI"/>
+          <w:b w:val="0"/>
+          <w:i w:val="0"/>
+          <w:u w:val="none"/>
         </w:rPr>
         <w:t xml:space="preserve"> गुजर जाने के लिए </w:t>
       </w:r>
       <w:r>
         <w:rPr>
           <w:rFonts w:cs="Nirmala UI" w:eastAsia="Nirmala UI"/>
+          <w:b w:val="0"/>
+          <w:i w:val="0"/>
+          <w:u w:val="none"/>
         </w:rPr>
         <w:t xml:space="preserve">का </w:t>
       </w:r>
       <w:r>
-        <w:rPr/>
+        <w:rPr>
+          <w:b w:val="0"/>
+          <w:i w:val="0"/>
+          <w:u w:val="none"/>
+        </w:rPr>
         <w:t>—</w:t>
       </w:r>
     </w:p>
@@ -412,7 +538,10 @@
             </w:pPr>
             <w:r>
               <w:rPr>
+                <w:b w:val="0"/>
+                <w:i w:val="0"/>
                 <w:color w:val="000000"/>
+                <w:u w:val="none"/>
               </w:rPr>
               <w:t>1.</w:t>
             </w:r>
@@ -435,24 +564,36 @@
             <w:r>
               <w:rPr>
                 <w:rFonts w:cs="Nirmala UI" w:eastAsia="Nirmala UI"/>
+                <w:b w:val="0"/>
+                <w:i w:val="0"/>
+                <w:u w:val="none"/>
               </w:rPr>
               <w:t xml:space="preserve">डा.. </w:t>
             </w:r>
             <w:r>
               <w:rPr>
                 <w:rFonts w:cs="Nirmala UI" w:eastAsia="Nirmala UI"/>
+                <w:b w:val="0"/>
+                <w:i w:val="0"/>
+                <w:u w:val="none"/>
               </w:rPr>
               <w:t>महेंद्र जी</w:t>
             </w:r>
             <w:r>
               <w:rPr>
                 <w:rFonts w:cs="Nirmala UI" w:eastAsia="Nirmala UI"/>
+                <w:b w:val="0"/>
+                <w:i w:val="0"/>
+                <w:u w:val="none"/>
               </w:rPr>
               <w:t xml:space="preserve"> प्रसाद बैठते हैं </w:t>
             </w:r>
             <w:r>
               <w:rPr>
                 <w:rFonts w:cs="Nirmala UI" w:eastAsia="Nirmala UI"/>
+                <w:b w:val="0"/>
+                <w:i w:val="0"/>
+                <w:u w:val="none"/>
               </w:rPr>
               <w:t>सदस्य;</w:t>
             </w:r>
@@ -480,7 +621,10 @@
             </w:pPr>
             <w:r>
               <w:rPr>
+                <w:b w:val="0"/>
+                <w:i w:val="0"/>
                 <w:color w:val="000000"/>
+                <w:u w:val="none"/>
               </w:rPr>
               <w:t>2.</w:t>
             </w:r>
@@ -503,25 +647,37 @@
             <w:r>
               <w:rPr>
                 <w:rFonts w:cs="Nirmala UI" w:eastAsia="Nirmala UI"/>
+                <w:b w:val="0"/>
+                <w:i w:val="0"/>
+                <w:u w:val="none"/>
               </w:rPr>
               <w:t xml:space="preserve">श्री </w:t>
             </w:r>
             <w:r>
               <w:rPr>
                 <w:rFonts w:cs="Nirmala UI" w:eastAsia="Nirmala UI"/>
+                <w:b w:val="0"/>
+                <w:i w:val="0"/>
+                <w:u w:val="none"/>
               </w:rPr>
               <w:t>जयंत</w:t>
             </w:r>
             <w:r>
               <w:rPr>
                 <w:rFonts w:cs="Nirmala UI" w:eastAsia="Nirmala UI"/>
+                <w:b w:val="0"/>
+                <w:i w:val="0"/>
+                <w:u w:val="none"/>
               </w:rPr>
               <w:t xml:space="preserve"> रॉय, </w:t>
             </w:r>
             <w:r>
               <w:rPr>
                 <w:rFonts w:cs="Nirmala UI" w:eastAsia="Nirmala UI"/>
+                <w:b w:val="0"/>
+                <w:i w:val="0"/>
                 <w:color w:val="000000"/>
+                <w:u w:val="none"/>
               </w:rPr>
               <w:t>(पूर्व सदस्य);</w:t>
             </w:r>
@@ -549,7 +705,10 @@
             </w:pPr>
             <w:r>
               <w:rPr>
+                <w:b w:val="0"/>
+                <w:i w:val="0"/>
                 <w:color w:val="000000"/>
+                <w:u w:val="none"/>
               </w:rPr>
               <w:t>3.</w:t>
             </w:r>
@@ -572,25 +731,37 @@
             <w:r>
               <w:rPr>
                 <w:rFonts w:cs="Nirmala UI" w:eastAsia="Nirmala UI"/>
+                <w:b w:val="0"/>
+                <w:i w:val="0"/>
+                <w:u w:val="none"/>
               </w:rPr>
               <w:t xml:space="preserve">श्री </w:t>
             </w:r>
             <w:r>
               <w:rPr>
                 <w:rFonts w:cs="Nirmala UI" w:eastAsia="Nirmala UI"/>
+                <w:b w:val="0"/>
+                <w:i w:val="0"/>
+                <w:u w:val="none"/>
               </w:rPr>
               <w:t>देबेंद्र</w:t>
             </w:r>
             <w:r>
               <w:rPr>
                 <w:rFonts w:cs="Nirmala UI" w:eastAsia="Nirmala UI"/>
+                <w:b w:val="0"/>
+                <w:i w:val="0"/>
+                <w:u w:val="none"/>
               </w:rPr>
               <w:t xml:space="preserve"> नाथ बर्मन, </w:t>
             </w:r>
             <w:r>
               <w:rPr>
                 <w:rFonts w:cs="Nirmala UI" w:eastAsia="Nirmala UI"/>
+                <w:b w:val="0"/>
+                <w:i w:val="0"/>
                 <w:color w:val="000000"/>
+                <w:u w:val="none"/>
               </w:rPr>
               <w:t>(पूर्व सदस्य);</w:t>
             </w:r>
@@ -618,7 +789,10 @@
             </w:pPr>
             <w:r>
               <w:rPr>
+                <w:b w:val="0"/>
+                <w:i w:val="0"/>
                 <w:color w:val="000000"/>
+                <w:u w:val="none"/>
               </w:rPr>
               <w:t>4.</w:t>
             </w:r>
@@ -641,13 +815,19 @@
             <w:r>
               <w:rPr>
                 <w:rFonts w:cs="Nirmala UI" w:eastAsia="Nirmala UI"/>
+                <w:b w:val="0"/>
+                <w:i w:val="0"/>
+                <w:u w:val="none"/>
               </w:rPr>
-              <w:t xml:space="preserve">श्री एम. मूसा, </w:t>
+              <w:t xml:space="preserve">श्री एम. मूस., </w:t>
             </w:r>
             <w:r>
               <w:rPr>
                 <w:rFonts w:cs="Nirmala UI" w:eastAsia="Nirmala UI"/>
+                <w:b w:val="0"/>
+                <w:i w:val="0"/>
                 <w:color w:val="000000"/>
+                <w:u w:val="none"/>
               </w:rPr>
               <w:t>(पूर्व सदस्य);</w:t>
             </w:r>
@@ -675,7 +855,10 @@
             </w:pPr>
             <w:r>
               <w:rPr>
+                <w:b w:val="0"/>
+                <w:i w:val="0"/>
                 <w:color w:val="000000"/>
+                <w:u w:val="none"/>
               </w:rPr>
               <w:t>5.</w:t>
             </w:r>
@@ -698,25 +881,37 @@
             <w:r>
               <w:rPr>
                 <w:rFonts w:cs="Nirmala UI" w:eastAsia="Nirmala UI"/>
+                <w:b w:val="0"/>
+                <w:i w:val="0"/>
+                <w:u w:val="none"/>
               </w:rPr>
               <w:t xml:space="preserve">श्री </w:t>
             </w:r>
             <w:r>
               <w:rPr>
                 <w:rFonts w:cs="Nirmala UI" w:eastAsia="Nirmala UI"/>
+                <w:b w:val="0"/>
+                <w:i w:val="0"/>
+                <w:u w:val="none"/>
               </w:rPr>
               <w:t>गनेश्वर</w:t>
             </w:r>
             <w:r>
               <w:rPr>
                 <w:rFonts w:cs="Nirmala UI" w:eastAsia="Nirmala UI"/>
+                <w:b w:val="0"/>
+                <w:i w:val="0"/>
+                <w:u w:val="none"/>
               </w:rPr>
               <w:t xml:space="preserve"> कुसुम., </w:t>
             </w:r>
             <w:r>
               <w:rPr>
                 <w:rFonts w:cs="Nirmala UI" w:eastAsia="Nirmala UI"/>
+                <w:b w:val="0"/>
+                <w:i w:val="0"/>
                 <w:color w:val="000000"/>
+                <w:u w:val="none"/>
               </w:rPr>
               <w:t>(पूर्व सदस्य; और</w:t>
             </w:r>
@@ -744,7 +939,10 @@
             </w:pPr>
             <w:r>
               <w:rPr>
+                <w:b w:val="0"/>
+                <w:i w:val="0"/>
                 <w:color w:val="000000"/>
+                <w:u w:val="none"/>
               </w:rPr>
               <w:t>6.</w:t>
             </w:r>
@@ -767,18 +965,27 @@
             <w:r>
               <w:rPr>
                 <w:rFonts w:cs="Nirmala UI" w:eastAsia="Nirmala UI"/>
+                <w:b w:val="0"/>
+                <w:i w:val="0"/>
+                <w:u w:val="none"/>
               </w:rPr>
               <w:t xml:space="preserve">पंडित जी </w:t>
             </w:r>
             <w:r>
               <w:rPr>
                 <w:rFonts w:cs="Nirmala UI" w:eastAsia="Nirmala UI"/>
+                <w:b w:val="0"/>
+                <w:i w:val="0"/>
+                <w:u w:val="none"/>
               </w:rPr>
               <w:t>बिरजू</w:t>
             </w:r>
             <w:r>
               <w:rPr>
                 <w:rFonts w:cs="Nirmala UI" w:eastAsia="Nirmala UI"/>
+                <w:b w:val="0"/>
+                <w:i w:val="0"/>
+                <w:u w:val="none"/>
               </w:rPr>
               <w:t xml:space="preserve"> महाराज , महान कथक नर्तक</w:t>
             </w:r>
@@ -798,7 +1005,11 @@
         <w:jc w:val="center"/>
       </w:pPr>
       <w:r>
-        <w:rPr/>
+        <w:rPr>
+          <w:b w:val="0"/>
+          <w:i w:val="0"/>
+          <w:u w:val="none"/>
+        </w:rPr>
         <w:t>————</w:t>
       </w:r>
     </w:p>
@@ -814,18 +1025,27 @@
       <w:r>
         <w:rPr>
           <w:rFonts w:cs="Nirmala UI" w:eastAsia="Nirmala UI"/>
+          <w:b w:val="0"/>
+          <w:i w:val="0"/>
+          <w:u w:val="none"/>
         </w:rPr>
         <w:t>पेपर</w:t>
       </w:r>
       <w:r>
         <w:rPr>
           <w:rFonts w:cs="Nirmala UI" w:eastAsia="Nirmala UI"/>
+          <w:b w:val="0"/>
+          <w:i w:val="0"/>
+          <w:u w:val="none"/>
         </w:rPr>
         <w:t>एस</w:t>
       </w:r>
       <w:r>
         <w:rPr>
           <w:rFonts w:cs="Nirmala UI" w:eastAsia="Nirmala UI"/>
+          <w:b w:val="0"/>
+          <w:i w:val="0"/>
+          <w:u w:val="none"/>
         </w:rPr>
         <w:t xml:space="preserve"> टैब पर LAID</w:t>
       </w:r>
@@ -838,38 +1058,62 @@
         <w:jc w:val="both"/>
       </w:pPr>
       <w:r>
-        <w:rPr/>
+        <w:rPr>
+          <w:b w:val="0"/>
+          <w:i w:val="0"/>
+          <w:u w:val="none"/>
+        </w:rPr>
         <w:t>1.</w:t>
       </w:r>
       <w:r>
-        <w:rPr/>
+        <w:rPr>
+          <w:b w:val="0"/>
+          <w:i w:val="0"/>
+          <w:u w:val="none"/>
+        </w:rPr>
         <w:t xml:space="preserve"> </w:t>
       </w:r>
       <w:r>
-        <w:rPr/>
+        <w:rPr>
+          <w:b w:val="0"/>
+          <w:i w:val="0"/>
+          <w:u w:val="none"/>
+        </w:rPr>
         <w:t xml:space="preserve">  </w:t>
       </w:r>
       <w:r>
         <w:rPr>
           <w:rFonts w:cs="Nirmala UI" w:eastAsia="Nirmala UI"/>
+          <w:b w:val="0"/>
+          <w:i w:val="0"/>
+          <w:u w:val="none"/>
         </w:rPr>
         <w:t>सेक्रिटेरी-जेनरल</w:t>
       </w:r>
       <w:r>
         <w:rPr>
           <w:rFonts w:cs="Nirmala UI" w:eastAsia="Nirmala UI"/>
+          <w:b w:val="0"/>
+          <w:i w:val="0"/>
+          <w:u w:val="none"/>
         </w:rPr>
         <w:t xml:space="preserve"> पर लेटने के लिए </w:t>
       </w:r>
       <w:r>
         <w:rPr>
           <w:rFonts w:cs="Nirmala UI" w:eastAsia="Nirmala UI"/>
+          <w:b w:val="0"/>
+          <w:i w:val="0"/>
+          <w:u w:val="none"/>
         </w:rPr>
         <w:t xml:space="preserve">गोली, </w:t>
       </w:r>
       <w:r>
         <w:rPr>
           <w:rFonts w:cs="Nirmala UI" w:eastAsia="Nirmala UI"/>
+          <w:b w:val="0"/>
+          <w:i w:val="0"/>
+          <w:u w:val="none"/>
         </w:rPr>
         <w:t>(अंग्रेजी और हिंदी में) राज्यसभा के दो सौ पचास वें सत्र के दौरान संसद के सदनों द्वारा पारित विधेयकों को दर्शाता है और राष्ट्रपति द्वारा अनुमोदित किया गया है.</w:t>
       </w:r>
@@ -882,39 +1126,69 @@
         <w:jc w:val="both"/>
       </w:pPr>
       <w:r>
-        <w:rPr/>
+        <w:rPr>
+          <w:b w:val="0"/>
+          <w:i w:val="0"/>
+          <w:u w:val="none"/>
+        </w:rPr>
         <w:t>2</w:t>
       </w:r>
       <w:r>
-        <w:rPr/>
+        <w:rPr>
+          <w:b w:val="0"/>
+          <w:i w:val="0"/>
+          <w:u w:val="none"/>
+        </w:rPr>
         <w:t>.</w:t>
       </w:r>
       <w:r>
-        <w:rPr/>
+        <w:rPr>
+          <w:b w:val="0"/>
+          <w:i w:val="0"/>
+          <w:u w:val="none"/>
+        </w:rPr>
         <w:t xml:space="preserve"> </w:t>
       </w:r>
       <w:r>
-        <w:rPr/>
+        <w:rPr>
+          <w:b w:val="0"/>
+          <w:i w:val="0"/>
+          <w:u w:val="none"/>
+        </w:rPr>
         <w:t xml:space="preserve">   </w:t>
       </w:r>
       <w:r>
         <w:rPr>
           <w:rFonts w:cs="Nirmala UI" w:eastAsia="Nirmala UI"/>
+          <w:b w:val="0"/>
+          <w:i w:val="0"/>
+          <w:u w:val="none"/>
         </w:rPr>
         <w:t>श्रीमंती निरामला सिद्धिमान</w:t>
       </w:r>
       <w:r>
-        <w:rPr/>
+        <w:rPr>
+          <w:b w:val="0"/>
+          <w:i w:val="0"/>
+          <w:u w:val="none"/>
+        </w:rPr>
         <w:t xml:space="preserve"> </w:t>
       </w:r>
       <w:r>
         <w:rPr>
           <w:rFonts w:cs="Nirmala UI" w:eastAsia="Nirmala UI"/>
+          <w:b w:val="0"/>
+          <w:i w:val="0"/>
+          <w:u w:val="none"/>
         </w:rPr>
         <w:t xml:space="preserve">  सांख्यिकी परिशिष्ट के साथ आर्थिक सर्वेक्षण 2021-22 की एक प्रति (अंग्रेजी और हिंदी में) सारणी पर रखना.</w:t>
       </w:r>
       <w:r>
-        <w:rPr/>
+        <w:rPr>
+          <w:b w:val="0"/>
+          <w:i w:val="0"/>
+          <w:u w:val="none"/>
+        </w:rPr>
         <w:t xml:space="preserve"> </w:t>
       </w:r>
     </w:p>
@@ -944,47 +1218,85 @@
       <w:r>
         <w:rPr>
           <w:rFonts w:cs="Nirmala UI" w:eastAsia="Nirmala UI"/>
+          <w:b w:val="0"/>
+          <w:i w:val="0"/>
+          <w:u w:val="none"/>
         </w:rPr>
         <w:t>नई दिल्ली.;</w:t>
       </w:r>
       <w:r>
-        <w:rPr/>
+        <w:rPr>
+          <w:b w:val="0"/>
+          <w:i w:val="0"/>
+          <w:u w:val="none"/>
+        </w:rPr>
         <w:tab/>
       </w:r>
       <w:r>
-        <w:rPr/>
+        <w:rPr>
+          <w:b w:val="0"/>
+          <w:i w:val="0"/>
+          <w:u w:val="none"/>
+        </w:rPr>
         <w:tab/>
       </w:r>
       <w:r>
-        <w:rPr/>
+        <w:rPr>
+          <w:b w:val="0"/>
+          <w:i w:val="0"/>
+          <w:u w:val="none"/>
+        </w:rPr>
         <w:tab/>
       </w:r>
       <w:r>
-        <w:rPr/>
+        <w:rPr>
+          <w:b w:val="0"/>
+          <w:i w:val="0"/>
+          <w:u w:val="none"/>
+        </w:rPr>
         <w:tab/>
         <w:t xml:space="preserve">  </w:t>
       </w:r>
       <w:r>
-        <w:rPr/>
+        <w:rPr>
+          <w:b w:val="0"/>
+          <w:i w:val="0"/>
+          <w:u w:val="none"/>
+        </w:rPr>
         <w:tab/>
       </w:r>
       <w:r>
-        <w:rPr/>
+        <w:rPr>
+          <w:b w:val="0"/>
+          <w:i w:val="0"/>
+          <w:u w:val="none"/>
+        </w:rPr>
         <w:t xml:space="preserve">   </w:t>
       </w:r>
       <w:r>
-        <w:rPr/>
+        <w:rPr>
+          <w:b w:val="0"/>
+          <w:i w:val="0"/>
+          <w:u w:val="none"/>
+        </w:rPr>
         <w:t xml:space="preserve"> </w:t>
       </w:r>
       <w:r>
         <w:rPr>
           <w:rFonts w:cs="Nirmala UI" w:eastAsia="Nirmala UI"/>
+          <w:b w:val="0"/>
+          <w:i w:val="0"/>
+          <w:u w:val="none"/>
         </w:rPr>
         <w:tab/>
         <w:t xml:space="preserve">          पी. सी. मोडी</w:t>
       </w:r>
       <w:r>
-        <w:rPr/>
+        <w:rPr>
+          <w:b w:val="0"/>
+          <w:i w:val="0"/>
+          <w:u w:val="none"/>
+        </w:rPr>
         <w:t>,</w:t>
       </w:r>
     </w:p>
@@ -1000,67 +1312,124 @@
       <w:r>
         <w:rPr>
           <w:rFonts w:cs="Nirmala UI" w:eastAsia="Nirmala UI"/>
+          <w:b w:val="0"/>
+          <w:i w:val="0"/>
+          <w:u w:val="none"/>
         </w:rPr>
         <w:t xml:space="preserve">जनवरी </w:t>
       </w:r>
       <w:r>
-        <w:rPr/>
+        <w:rPr>
+          <w:b w:val="0"/>
+          <w:i w:val="0"/>
+          <w:u w:val="none"/>
+        </w:rPr>
         <w:t>28</w:t>
       </w:r>
       <w:r>
-        <w:rPr/>
+        <w:rPr>
+          <w:b w:val="0"/>
+          <w:i w:val="0"/>
+          <w:u w:val="none"/>
+        </w:rPr>
         <w:t>, 20</w:t>
       </w:r>
       <w:r>
-        <w:rPr/>
+        <w:rPr>
+          <w:b w:val="0"/>
+          <w:i w:val="0"/>
+          <w:u w:val="none"/>
+        </w:rPr>
         <w:t>2</w:t>
       </w:r>
       <w:r>
-        <w:rPr/>
+        <w:rPr>
+          <w:b w:val="0"/>
+          <w:i w:val="0"/>
+          <w:u w:val="none"/>
+        </w:rPr>
         <w:t>2</w:t>
       </w:r>
       <w:r>
-        <w:rPr/>
+        <w:rPr>
+          <w:b w:val="0"/>
+          <w:i w:val="0"/>
+          <w:u w:val="none"/>
+        </w:rPr>
         <w:t>.</w:t>
       </w:r>
       <w:r>
-        <w:rPr/>
+        <w:rPr>
+          <w:b w:val="0"/>
+          <w:i w:val="0"/>
+          <w:u w:val="none"/>
+        </w:rPr>
         <w:tab/>
       </w:r>
       <w:r>
-        <w:rPr/>
+        <w:rPr>
+          <w:b w:val="0"/>
+          <w:i w:val="0"/>
+          <w:u w:val="none"/>
+        </w:rPr>
         <w:tab/>
       </w:r>
       <w:r>
-        <w:rPr/>
+        <w:rPr>
+          <w:b w:val="0"/>
+          <w:i w:val="0"/>
+          <w:u w:val="none"/>
+        </w:rPr>
         <w:tab/>
       </w:r>
       <w:r>
-        <w:rPr/>
+        <w:rPr>
+          <w:b w:val="0"/>
+          <w:i w:val="0"/>
+          <w:u w:val="none"/>
+        </w:rPr>
         <w:t xml:space="preserve">      </w:t>
       </w:r>
       <w:r>
-        <w:rPr/>
+        <w:rPr>
+          <w:b w:val="0"/>
+          <w:i w:val="0"/>
+          <w:u w:val="none"/>
+        </w:rPr>
         <w:t xml:space="preserve">          </w:t>
       </w:r>
       <w:r>
-        <w:rPr/>
+        <w:rPr>
+          <w:b w:val="0"/>
+          <w:i w:val="0"/>
+          <w:u w:val="none"/>
+        </w:rPr>
         <w:t xml:space="preserve"> </w:t>
       </w:r>
       <w:r>
-        <w:rPr/>
+        <w:rPr>
+          <w:b w:val="0"/>
+          <w:i w:val="0"/>
+          <w:u w:val="none"/>
+        </w:rPr>
         <w:t xml:space="preserve">              </w:t>
       </w:r>
       <w:r>
-        <w:rPr/>
+        <w:rPr>
+          <w:b w:val="0"/>
+          <w:i w:val="0"/>
+          <w:u w:val="none"/>
+        </w:rPr>
         <w:tab/>
         <w:t xml:space="preserve"> </w:t>
       </w:r>
       <w:r>
         <w:rPr>
           <w:rFonts w:cs="Nirmala UI" w:eastAsia="Nirmala UI"/>
+          <w:b w:val="0"/>
           <w:i/>
-          <w:iCs w:val="1"/>
+          <w:iCs/>
+          <w:u w:val="none"/>
         </w:rPr>
         <w:t>महासचिव.</w:t>
       </w:r>
@@ -1068,6 +1437,10 @@
     <w:sectPr>
       <w:footerReference w:type="even" r:id="rId8"/>
       <w:footerReference w:type="default" r:id="rId9"/>
+      <w:headerReference w:type="default" r:id="rId12"/>
+      <w:headerReference w:type="first" r:id="rId13"/>
+      <w:headerReference w:type="even" r:id="rId14"/>
+      <w:footerReference w:type="first" r:id="rId15"/>
       <w:pgSz w:w="11907" w:h="16840" w:code="9"/>
       <w:pgMar w:top="709" w:right="2591" w:bottom="1440" w:left="2591" w:header="1077" w:footer="1077" w:gutter="0"/>
       <w:pgNumType w:start="1"/>
@@ -1183,6 +1556,16 @@
 </w:ftr>
 </file>
 
+<file path=word/footer3.xml><?xml version="1.0" encoding="utf-8"?>
+<w:ftr xmlns:m="http://schemas.openxmlformats.org/officeDocument/2006/math" xmlns:mc="http://schemas.openxmlformats.org/markup-compatibility/2006" xmlns:mo="http://schemas.microsoft.com/office/mac/office/2008/main" xmlns:mv="urn:schemas-microsoft-com:mac:vml" xmlns:o="urn:schemas-microsoft-com:office:office" xmlns:r="http://schemas.openxmlformats.org/officeDocument/2006/relationships" xmlns:v="urn:schemas-microsoft-com:vml" xmlns:w10="urn:schemas-microsoft-com:office:word" xmlns:w14="http://schemas.microsoft.com/office/word/2010/wordml" xmlns:w="http://schemas.openxmlformats.org/wordprocessingml/2006/main" xmlns:wne="http://schemas.microsoft.com/office/word/2006/wordml" xmlns:wp14="http://schemas.microsoft.com/office/word/2010/wordprocessingDrawing" xmlns:wp="http://schemas.openxmlformats.org/drawingml/2006/wordprocessingDrawing" xmlns:wpc="http://schemas.microsoft.com/office/word/2010/wordprocessingCanvas" xmlns:wpg="http://schemas.microsoft.com/office/word/2010/wordprocessingGroup" xmlns:wpi="http://schemas.microsoft.com/office/word/2010/wordprocessingInk" xmlns:wps="http://schemas.microsoft.com/office/word/2010/wordprocessingShape" mc:Ignorable="w14 wp14">
+  <w:p>
+    <w:pPr>
+      <w:pStyle w:val="Footer"/>
+    </w:pPr>
+  </w:p>
+</w:ftr>
+</file>
+
 <file path=word/footnotes.xml><?xml version="1.0" encoding="utf-8"?>
 <w:footnotes xmlns:wpc="http://schemas.microsoft.com/office/word/2010/wordprocessingCanvas" xmlns:cx="http://schemas.microsoft.com/office/drawing/2014/chartex" xmlns:cx1="http://schemas.microsoft.com/office/drawing/2015/9/8/chartex" xmlns:cx2="http://schemas.microsoft.com/office/drawing/2015/10/21/chartex" xmlns:cx3="http://schemas.microsoft.com/office/drawing/2016/5/9/chartex" xmlns:cx4="http://schemas.microsoft.com/office/drawing/2016/5/10/chartex" xmlns:cx5="http://schemas.microsoft.com/office/drawing/2016/5/11/chartex" xmlns:cx6="http://schemas.microsoft.com/office/drawing/2016/5/12/chartex" xmlns:cx7="http://schemas.microsoft.com/office/drawing/2016/5/13/chartex" xmlns:cx8="http://schemas.microsoft.com/office/drawing/2016/5/14/chartex" xmlns:mc="http://schemas.openxmlformats.org/markup-compatibility/2006" xmlns:aink="http://schemas.microsoft.com/office/drawing/2016/ink" xmlns:am3d="http://schemas.microsoft.com/office/drawing/2017/model3d" xmlns:o="urn:schemas-microsoft-com:office:office" xmlns:r="http://schemas.openxmlformats.org/officeDocument/2006/relationships" xmlns:m="http://schemas.openxmlformats.org/officeDocument/2006/math" xmlns:v="urn:schemas-microsoft-com:vml" xmlns:wp14="http://schemas.microsoft.com/office/word/2010/wordprocessingDrawing" xmlns:wp="http://schemas.openxmlformats.org/drawingml/2006/wordprocessingDrawing" xmlns:w10="urn:schemas-microsoft-com:office:word" xmlns:w="http://schemas.openxmlformats.org/wordprocessingml/2006/main" xmlns:w14="http://schemas.microsoft.com/office/word/2010/wordml" xmlns:w15="http://schemas.microsoft.com/office/word/2012/wordml" xmlns:w16cex="http://schemas.microsoft.com/office/word/2018/wordml/cex" xmlns:w16cid="http://schemas.microsoft.com/office/word/2016/wordml/cid" xmlns:w16="http://schemas.microsoft.com/office/word/2018/wordml" xmlns:w16sdtdh="http://schemas.microsoft.com/office/word/2020/wordml/sdtdatahash" xmlns:w16se="http://schemas.microsoft.com/office/word/2015/wordml/symex" xmlns:wpg="http://schemas.microsoft.com/office/word/2010/wordprocessingGroup" xmlns:wpi="http://schemas.microsoft.com/office/word/2010/wordprocessingInk" xmlns:wne="http://schemas.microsoft.com/office/word/2006/wordml" xmlns:wps="http://schemas.microsoft.com/office/word/2010/wordprocessingShape" mc:Ignorable="w14 w15 w16se w16cid w16 w16cex w16sdtdh wp14">
   <w:footnote w:type="separator" w:id="-1">
@@ -1200,6 +1583,36 @@
     </w:p>
   </w:footnote>
 </w:footnotes>
+</file>
+
+<file path=word/header1.xml><?xml version="1.0" encoding="utf-8"?>
+<w:hdr xmlns:m="http://schemas.openxmlformats.org/officeDocument/2006/math" xmlns:mc="http://schemas.openxmlformats.org/markup-compatibility/2006" xmlns:mo="http://schemas.microsoft.com/office/mac/office/2008/main" xmlns:mv="urn:schemas-microsoft-com:mac:vml" xmlns:o="urn:schemas-microsoft-com:office:office" xmlns:r="http://schemas.openxmlformats.org/officeDocument/2006/relationships" xmlns:v="urn:schemas-microsoft-com:vml" xmlns:w10="urn:schemas-microsoft-com:office:word" xmlns:w14="http://schemas.microsoft.com/office/word/2010/wordml" xmlns:w="http://schemas.openxmlformats.org/wordprocessingml/2006/main" xmlns:wne="http://schemas.microsoft.com/office/word/2006/wordml" xmlns:wp14="http://schemas.microsoft.com/office/word/2010/wordprocessingDrawing" xmlns:wp="http://schemas.openxmlformats.org/drawingml/2006/wordprocessingDrawing" xmlns:wpc="http://schemas.microsoft.com/office/word/2010/wordprocessingCanvas" xmlns:wpg="http://schemas.microsoft.com/office/word/2010/wordprocessingGroup" xmlns:wpi="http://schemas.microsoft.com/office/word/2010/wordprocessingInk" xmlns:wps="http://schemas.microsoft.com/office/word/2010/wordprocessingShape" mc:Ignorable="w14 wp14">
+  <w:p>
+    <w:pPr>
+      <w:pStyle w:val="Header"/>
+    </w:pPr>
+  </w:p>
+</w:hdr>
+</file>
+
+<file path=word/header2.xml><?xml version="1.0" encoding="utf-8"?>
+<w:hdr xmlns:m="http://schemas.openxmlformats.org/officeDocument/2006/math" xmlns:mc="http://schemas.openxmlformats.org/markup-compatibility/2006" xmlns:mo="http://schemas.microsoft.com/office/mac/office/2008/main" xmlns:mv="urn:schemas-microsoft-com:mac:vml" xmlns:o="urn:schemas-microsoft-com:office:office" xmlns:r="http://schemas.openxmlformats.org/officeDocument/2006/relationships" xmlns:v="urn:schemas-microsoft-com:vml" xmlns:w10="urn:schemas-microsoft-com:office:word" xmlns:w14="http://schemas.microsoft.com/office/word/2010/wordml" xmlns:w="http://schemas.openxmlformats.org/wordprocessingml/2006/main" xmlns:wne="http://schemas.microsoft.com/office/word/2006/wordml" xmlns:wp14="http://schemas.microsoft.com/office/word/2010/wordprocessingDrawing" xmlns:wp="http://schemas.openxmlformats.org/drawingml/2006/wordprocessingDrawing" xmlns:wpc="http://schemas.microsoft.com/office/word/2010/wordprocessingCanvas" xmlns:wpg="http://schemas.microsoft.com/office/word/2010/wordprocessingGroup" xmlns:wpi="http://schemas.microsoft.com/office/word/2010/wordprocessingInk" xmlns:wps="http://schemas.microsoft.com/office/word/2010/wordprocessingShape" mc:Ignorable="w14 wp14">
+  <w:p>
+    <w:pPr>
+      <w:pStyle w:val="Header"/>
+    </w:pPr>
+  </w:p>
+</w:hdr>
+</file>
+
+<file path=word/header3.xml><?xml version="1.0" encoding="utf-8"?>
+<w:hdr xmlns:m="http://schemas.openxmlformats.org/officeDocument/2006/math" xmlns:mc="http://schemas.openxmlformats.org/markup-compatibility/2006" xmlns:mo="http://schemas.microsoft.com/office/mac/office/2008/main" xmlns:mv="urn:schemas-microsoft-com:mac:vml" xmlns:o="urn:schemas-microsoft-com:office:office" xmlns:r="http://schemas.openxmlformats.org/officeDocument/2006/relationships" xmlns:v="urn:schemas-microsoft-com:vml" xmlns:w10="urn:schemas-microsoft-com:office:word" xmlns:w14="http://schemas.microsoft.com/office/word/2010/wordml" xmlns:w="http://schemas.openxmlformats.org/wordprocessingml/2006/main" xmlns:wne="http://schemas.microsoft.com/office/word/2006/wordml" xmlns:wp14="http://schemas.microsoft.com/office/word/2010/wordprocessingDrawing" xmlns:wp="http://schemas.openxmlformats.org/drawingml/2006/wordprocessingDrawing" xmlns:wpc="http://schemas.microsoft.com/office/word/2010/wordprocessingCanvas" xmlns:wpg="http://schemas.microsoft.com/office/word/2010/wordprocessingGroup" xmlns:wpi="http://schemas.microsoft.com/office/word/2010/wordprocessingInk" xmlns:wps="http://schemas.microsoft.com/office/word/2010/wordprocessingShape" mc:Ignorable="w14 wp14">
+  <w:p>
+    <w:pPr>
+      <w:pStyle w:val="Header"/>
+    </w:pPr>
+  </w:p>
+</w:hdr>
 </file>
 
 <file path=word/numbering.xml><?xml version="1.0" encoding="utf-8"?>

</xml_diff>